<commit_message>
Update Mark-Lynd-Resume.docx for marklynd username
</commit_message>
<xml_diff>
--- a/Mark-Lynd-Resume.docx
+++ b/Mark-Lynd-Resume.docx
@@ -51,7 +51,7 @@
         </w:rPr>
         <w:t xml:space="preserve">Frisco, Texas   |   </w:t>
       </w:r>
-      <w:hyperlink w:history="1" r:id="rIdd33_3lrdjs2tqk_4cyhkl">
+      <w:hyperlink w:history="1" r:id="rId9cbsr7q5fepkbyselxtyw">
         <w:r>
           <w:rPr>
             <w:rFonts w:ascii="Calibri" w:cs="Calibri" w:eastAsia="Calibri" w:hAnsi="Calibri"/>
@@ -71,7 +71,7 @@
         </w:rPr>
         <w:t xml:space="preserve">   |   </w:t>
       </w:r>
-      <w:hyperlink w:history="1" r:id="rIdzzivuv31003l9hyoigltt">
+      <w:hyperlink w:history="1" r:id="rId0jc736tl1su-ig6fh-tjp">
         <w:r>
           <w:rPr>
             <w:rFonts w:ascii="Calibri" w:cs="Calibri" w:eastAsia="Calibri" w:hAnsi="Calibri"/>
@@ -91,7 +91,7 @@
         </w:rPr>
         <w:t xml:space="preserve">   |   </w:t>
       </w:r>
-      <w:hyperlink w:history="1" r:id="rIdhfw3wtdswhxfilt8xlqz-">
+      <w:hyperlink w:history="1" r:id="rIddf2jjsewcgssub17wqgdx">
         <w:r>
           <w:rPr>
             <w:rFonts w:ascii="Calibri" w:cs="Calibri" w:eastAsia="Calibri" w:hAnsi="Calibri"/>
@@ -282,7 +282,7 @@
           <w:sz w:val="21"/>
           <w:szCs w:val="21"/>
         </w:rPr>
-        <w:t xml:space="preserve">Python and the MCP Python SDK, JavaScript and Node.js, SQLite, REST APIs, Cloudflare Workers and D1, Stripe, webhook and form ingestion. Front end to API to database. Public code at github.com/cybervizer.</w:t>
+        <w:t xml:space="preserve">Python and the MCP Python SDK, JavaScript and Node.js, SQLite, REST APIs, Cloudflare Workers and D1, Stripe, webhook and form ingestion. Front end to API to database. Public code at github.com/marklynd.</w:t>
       </w:r>
     </w:p>
     <w:p>
@@ -513,7 +513,7 @@
           <w:sz w:val="21"/>
           <w:szCs w:val="21"/>
         </w:rPr>
-        <w:t xml:space="preserve">Python MCP server that exposes AI governance as callable tools. Maps 180 controls across NIST AI RMF, ISO/IEC 42001, and the EU AI Act, scores organizational readiness, classifies EU AI Act risk tiers, and generates remediation roadmaps. Ships with an eval harness scoring 0.82 hit at 1 on the mapping tool, 215 tests, typed and lint clean. github.com/cybervizer/mcp-ai-governance</w:t>
+        <w:t xml:space="preserve">Python MCP server that exposes AI governance as callable tools. Maps 180 controls across NIST AI RMF, ISO/IEC 42001, and the EU AI Act, scores organizational readiness, classifies EU AI Act risk tiers, and generates remediation roadmaps. Ships with an eval harness scoring 0.82 hit at 1 on the mapping tool, 215 tests, typed and lint clean. github.com/marklynd/mcp-ai-governance</w:t>
       </w:r>
     </w:p>
     <w:p>
@@ -543,7 +543,7 @@
           <w:sz w:val="21"/>
           <w:szCs w:val="21"/>
         </w:rPr>
-        <w:t xml:space="preserve">Python MCP server implementing a human-in-the-loop approval gate for agents. An agent cannot take a consequential action without a human decision, and every decision lands in a tamper-evident hash-chained audit log. 153 tests. github.com/cybervizer/mcp-approvals</w:t>
+        <w:t xml:space="preserve">Python MCP server implementing a human-in-the-loop approval gate for agents. An agent cannot take a consequential action without a human decision, and every decision lands in a tamper-evident hash-chained audit log. 153 tests. github.com/marklynd/mcp-approvals</w:t>
       </w:r>
     </w:p>
     <w:p>

</xml_diff>